<commit_message>
Keep the reviewing dietitian anonymous, and say so
The reviewer asked not to be named. The text never named her, so the change
is to explain the absence rather than leave it unexplained: 5.3 now records
that she is not named at her own request and that her identity and
qualification are held in a signed confirmation available to the examiners,
and appendix B says the same.

The disclosure that she is known personally to the author stays. It is what
creates the acquiescence risk the limitations already report, and the
approved proposal states it, so removing it would leave the dissertation
implying an independent reviewer where the proposal says otherwise.

The confirmation sheet now tells her plainly that her name is not published
and where the document goes, since the earlier wording said it would appear
as an appendix.
</commit_message>
<xml_diff>
--- a/docs/Βεβαίωση κλινικής επισκόπησης.docx
+++ b/docs/Βεβαίωση κλινικής επισκόπησης.docx
@@ -30,10 +30,22 @@
     </w:p>
     <w:p>
       <w:pPr>
+        <w:spacing w:after="160" w:line="264"/>
+      </w:pPr>
+      <w:r>
+        <w:t xml:space="preserve">Το παρόν συνοψίζει την κλινική επισκόπηση που πραγματοποιήσατε επί των παραδοχών του συστήματος. Δεν χρειάζεται να συμπληρώσετε ξανά κάτι: διαβάστε αν αποδίδονται σωστά οι απαντήσεις σας, διορθώστε ό,τι δεν στέκει, και υπογράψτε.</w:t>
+      </w:r>
+    </w:p>
+    <w:p>
+      <w:pPr>
         <w:spacing w:after="200" w:line="264"/>
       </w:pPr>
       <w:r>
-        <w:t xml:space="preserve">Το παρόν συνοψίζει την κλινική επισκόπηση που πραγματοποιήσατε επί των παραδοχών του συστήματος, ώστε να περιληφθεί ως παράρτημα στη διατριβή. Δεν χρειάζεται να συμπληρώσετε ξανά κάτι: διαβάστε αν αποδίδονται σωστά οι απαντήσεις σας, διορθώστε ό,τι δεν στέκει, και υπογράψτε.</w:t>
+        <w:rPr>
+          <w:b/>
+          <w:bCs/>
+        </w:rPr>
+        <w:t xml:space="preserve">Το όνομά σας ΔΕΝ δημοσιεύεται. Στο κείμενο της διατριβής αναφέρεστε μόνο ως πτυχιούχος διαιτολόγος-διατροφολόγος, και δηλώνεται ρητά ότι δεν κατονομάζεστε κατόπιν δικού σας αιτήματος. Το παρόν φυλάσσεται ξεχωριστά και προσκομίζεται μόνο αν το ζητήσει η εξεταστική επιτροπή.</w:t>
       </w:r>
     </w:p>
     <w:tbl>

</xml_diff>